<commit_message>
Add the roster, availability and home-screen pages to the guide
Three more pages in the same shape as the rest: adding the app to a phone,
who is working this week, and saying which days you can work. The page on
today's list also now mentions the day arrows and Other buildings, so the
buildings a cleaner is not scheduled for are findable.

The home-screen page shows each phone the bar it will actually get: the
app words that bar differently on an iPhone, where Safari has no one-tap
install, so that screenshot is taken through an iPhone user agent.

The stand-in API grows one route, /availability/mine, to draw that screen.

Co-Authored-By: Claude Opus 5 <noreply@anthropic.com>
Claude-Session: https://claude.ai/code/session_013Lc45xwjPXCB2Gc2UUvFTS
</commit_message>
<xml_diff>
--- a/docs/cleaner-manual.docx
+++ b/docs/cleaner-manual.docx
@@ -273,7 +273,7 @@
         <w:pStyle w:val="Heading1"/>
       </w:pPr>
       <w:r>
-        <w:t xml:space="preserve">What to clean today</w:t>
+        <w:t xml:space="preserve">Putting it on your phone</w:t>
       </w:r>
     </w:p>
     <w:p>
@@ -290,7 +290,7 @@
           <w:sz w:val="28"/>
           <w:szCs w:val="28"/>
         </w:rPr>
-        <w:t xml:space="preserve">The app opens on today’s list.</w:t>
+        <w:t xml:space="preserve">Open the app in your phone’s browser.</w:t>
       </w:r>
     </w:p>
     <w:p>
@@ -307,7 +307,7 @@
           <w:sz w:val="28"/>
           <w:szCs w:val="28"/>
         </w:rPr>
-        <w:t xml:space="preserve">Start at number 1 and work down.</w:t>
+        <w:t xml:space="preserve">On an iPhone: tap the Share button, then Add to Home Screen.</w:t>
       </w:r>
     </w:p>
     <w:p>
@@ -324,142 +324,7 @@
           <w:sz w:val="28"/>
           <w:szCs w:val="28"/>
         </w:rPr>
-        <w:t xml:space="preserve">Tap a building to open it.</w:t>
-      </w:r>
-    </w:p>
-    <w:p>
-      <w:pPr>
-        <w:spacing w:before="120"/>
-        <w:jc w:val="center"/>
-      </w:pPr>
-      <w:r>
-        <w:drawing>
-          <wp:inline distT="0" distB="0" distL="0" distR="0">
-            <wp:extent cx="2428875" cy="5257800"/>
-            <wp:effectExtent t="0" r="0" b="0" l="0"/>
-            <wp:docPr id="1" name="" descr="" title=""/>
-            <wp:cNvGraphicFramePr>
-              <a:graphicFrameLocks xmlns:a="http://schemas.openxmlformats.org/drawingml/2006/main" noChangeAspect="1"/>
-            </wp:cNvGraphicFramePr>
-            <a:graphic xmlns:a="http://schemas.openxmlformats.org/drawingml/2006/main">
-              <a:graphicData uri="http://schemas.openxmlformats.org/drawingml/2006/picture">
-                <pic:pic xmlns:pic="http://schemas.openxmlformats.org/drawingml/2006/picture">
-                  <pic:nvPicPr>
-                    <pic:cNvPr id="0" name="" descr=""/>
-                    <pic:cNvPicPr>
-                      <a:picLocks noChangeAspect="1" noChangeArrowheads="1"/>
-                    </pic:cNvPicPr>
-                  </pic:nvPicPr>
-                  <pic:blipFill>
-                    <a:blip r:embed="rId9" cstate="none"/>
-                    <a:srcRect/>
-                    <a:stretch>
-                      <a:fillRect/>
-                    </a:stretch>
-                  </pic:blipFill>
-                  <pic:spPr bwMode="auto">
-                    <a:xfrm>
-                      <a:off x="0" y="0"/>
-                      <a:ext cx="2428875" cy="5257800"/>
-                    </a:xfrm>
-                    <a:prstGeom prst="rect">
-                      <a:avLst/>
-                    </a:prstGeom>
-                  </pic:spPr>
-                </pic:pic>
-              </a:graphicData>
-            </a:graphic>
-          </wp:inline>
-        </w:drawing>
-      </w:r>
-    </w:p>
-    <w:p>
-      <w:pPr>
-        <w:spacing w:after="200" w:before="60"/>
-        <w:jc w:val="center"/>
-      </w:pPr>
-      <w:r>
-        <w:rPr>
-          <w:color w:val="5C6470"/>
-          <w:sz w:val="18"/>
-          <w:szCs w:val="18"/>
-        </w:rPr>
-        <w:t xml:space="preserve">Today’s list.</w:t>
-      </w:r>
-    </w:p>
-    <w:p>
-      <w:pPr>
-        <w:spacing w:after="160" w:before="160"/>
-      </w:pPr>
-      <w:r>
-        <w:rPr>
-          <w:color w:val="5C6470"/>
-        </w:rPr>
-        <w:t xml:space="preserve">Check means a quick tidy and re-stock. Full Clean means the whole clean. A green Done means someone has already finished that building.</w:t>
-      </w:r>
-    </w:p>
-    <w:p>
-      <w:r>
-        <w:br w:type="page"/>
-      </w:r>
-    </w:p>
-    <w:p>
-      <w:pPr>
-        <w:pStyle w:val="Heading1"/>
-      </w:pPr>
-      <w:r>
-        <w:t xml:space="preserve">When you finish a building</w:t>
-      </w:r>
-    </w:p>
-    <w:p>
-      <w:pPr>
-        <w:pStyle w:val="ListParagraph"/>
-        <w:numPr>
-          <w:ilvl w:val="0"/>
-          <w:numId w:val="4"/>
-        </w:numPr>
-        <w:spacing w:after="160"/>
-      </w:pPr>
-      <w:r>
-        <w:rPr>
-          <w:sz w:val="28"/>
-          <w:szCs w:val="28"/>
-        </w:rPr>
-        <w:t xml:space="preserve">Tap the blue button.</w:t>
-      </w:r>
-    </w:p>
-    <w:p>
-      <w:pPr>
-        <w:pStyle w:val="ListParagraph"/>
-        <w:numPr>
-          <w:ilvl w:val="0"/>
-          <w:numId w:val="4"/>
-        </w:numPr>
-        <w:spacing w:after="160"/>
-      </w:pPr>
-      <w:r>
-        <w:rPr>
-          <w:sz w:val="28"/>
-          <w:szCs w:val="28"/>
-        </w:rPr>
-        <w:t xml:space="preserve">Tap Yes, all done.</w:t>
-      </w:r>
-    </w:p>
-    <w:p>
-      <w:pPr>
-        <w:pStyle w:val="ListParagraph"/>
-        <w:numPr>
-          <w:ilvl w:val="0"/>
-          <w:numId w:val="4"/>
-        </w:numPr>
-        <w:spacing w:after="160"/>
-      </w:pPr>
-      <w:r>
-        <w:rPr>
-          <w:sz w:val="28"/>
-          <w:szCs w:val="28"/>
-        </w:rPr>
-        <w:t xml:space="preserve">That is it. The office can see it is finished.</w:t>
+        <w:t xml:space="preserve">On Android: tap Install on the bar under the names.</w:t>
       </w:r>
     </w:p>
     <w:tbl>
@@ -512,7 +377,376 @@
                           </pic:cNvPicPr>
                         </pic:nvPicPr>
                         <pic:blipFill>
-                          <a:blip r:embed="rId10" cstate="none"/>
+                          <a:blip r:embed="rId9" cstate="none"/>
+                          <a:srcRect/>
+                          <a:stretch>
+                            <a:fillRect/>
+                          </a:stretch>
+                        </pic:blipFill>
+                        <pic:spPr bwMode="auto">
+                          <a:xfrm>
+                            <a:off x="0" y="0"/>
+                            <a:ext cx="1905000" cy="4124325"/>
+                          </a:xfrm>
+                          <a:prstGeom prst="rect">
+                            <a:avLst/>
+                          </a:prstGeom>
+                        </pic:spPr>
+                      </pic:pic>
+                    </a:graphicData>
+                  </a:graphic>
+                </wp:inline>
+              </w:drawing>
+            </w:r>
+          </w:p>
+          <w:p>
+            <w:pPr>
+              <w:spacing w:after="200" w:before="60"/>
+              <w:jc w:val="center"/>
+            </w:pPr>
+            <w:r>
+              <w:rPr>
+                <w:color w:val="5C6470"/>
+                <w:sz w:val="18"/>
+                <w:szCs w:val="18"/>
+              </w:rPr>
+              <w:t xml:space="preserve">On an iPhone.</w:t>
+            </w:r>
+          </w:p>
+        </w:tc>
+        <w:tc>
+          <w:tcPr>
+            <w:tcW w:type="dxa" w:w="4390"/>
+            <w:tcMar>
+              <w:top w:type="dxa" w:w="80"/>
+              <w:left w:type="dxa" w:w="80"/>
+              <w:bottom w:type="dxa" w:w="80"/>
+              <w:right w:type="dxa" w:w="80"/>
+            </w:tcMar>
+          </w:tcPr>
+          <w:p>
+            <w:pPr>
+              <w:jc w:val="center"/>
+            </w:pPr>
+            <w:r>
+              <w:drawing>
+                <wp:inline distT="0" distB="0" distL="0" distR="0">
+                  <wp:extent cx="1905000" cy="4124325"/>
+                  <wp:effectExtent t="0" r="0" b="0" l="0"/>
+                  <wp:docPr id="1" name="" descr="" title=""/>
+                  <wp:cNvGraphicFramePr>
+                    <a:graphicFrameLocks xmlns:a="http://schemas.openxmlformats.org/drawingml/2006/main" noChangeAspect="1"/>
+                  </wp:cNvGraphicFramePr>
+                  <a:graphic xmlns:a="http://schemas.openxmlformats.org/drawingml/2006/main">
+                    <a:graphicData uri="http://schemas.openxmlformats.org/drawingml/2006/picture">
+                      <pic:pic xmlns:pic="http://schemas.openxmlformats.org/drawingml/2006/picture">
+                        <pic:nvPicPr>
+                          <pic:cNvPr id="0" name="" descr=""/>
+                          <pic:cNvPicPr>
+                            <a:picLocks noChangeAspect="1" noChangeArrowheads="1"/>
+                          </pic:cNvPicPr>
+                        </pic:nvPicPr>
+                        <pic:blipFill>
+                          <a:blip r:embed="rId7" cstate="none"/>
+                          <a:srcRect/>
+                          <a:stretch>
+                            <a:fillRect/>
+                          </a:stretch>
+                        </pic:blipFill>
+                        <pic:spPr bwMode="auto">
+                          <a:xfrm>
+                            <a:off x="0" y="0"/>
+                            <a:ext cx="1905000" cy="4124325"/>
+                          </a:xfrm>
+                          <a:prstGeom prst="rect">
+                            <a:avLst/>
+                          </a:prstGeom>
+                        </pic:spPr>
+                      </pic:pic>
+                    </a:graphicData>
+                  </a:graphic>
+                </wp:inline>
+              </w:drawing>
+            </w:r>
+          </w:p>
+          <w:p>
+            <w:pPr>
+              <w:spacing w:after="200" w:before="60"/>
+              <w:jc w:val="center"/>
+            </w:pPr>
+            <w:r>
+              <w:rPr>
+                <w:color w:val="5C6470"/>
+                <w:sz w:val="18"/>
+                <w:szCs w:val="18"/>
+              </w:rPr>
+              <w:t xml:space="preserve">On Android.</w:t>
+            </w:r>
+          </w:p>
+        </w:tc>
+      </w:tr>
+    </w:tbl>
+    <w:p>
+      <w:pPr>
+        <w:spacing w:after="160" w:before="160"/>
+      </w:pPr>
+      <w:r>
+        <w:rPr>
+          <w:color w:val="5C6470"/>
+        </w:rPr>
+        <w:t xml:space="preserve">You only do this once. The app then has its own icon, like any other app, and you never have to find the link again.</w:t>
+      </w:r>
+    </w:p>
+    <w:p>
+      <w:r>
+        <w:br w:type="page"/>
+      </w:r>
+    </w:p>
+    <w:p>
+      <w:pPr>
+        <w:pStyle w:val="Heading1"/>
+      </w:pPr>
+      <w:r>
+        <w:t xml:space="preserve">What to clean today</w:t>
+      </w:r>
+    </w:p>
+    <w:p>
+      <w:pPr>
+        <w:pStyle w:val="ListParagraph"/>
+        <w:numPr>
+          <w:ilvl w:val="0"/>
+          <w:numId w:val="4"/>
+        </w:numPr>
+        <w:spacing w:after="160"/>
+      </w:pPr>
+      <w:r>
+        <w:rPr>
+          <w:sz w:val="28"/>
+          <w:szCs w:val="28"/>
+        </w:rPr>
+        <w:t xml:space="preserve">The app opens on today’s list.</w:t>
+      </w:r>
+    </w:p>
+    <w:p>
+      <w:pPr>
+        <w:pStyle w:val="ListParagraph"/>
+        <w:numPr>
+          <w:ilvl w:val="0"/>
+          <w:numId w:val="4"/>
+        </w:numPr>
+        <w:spacing w:after="160"/>
+      </w:pPr>
+      <w:r>
+        <w:rPr>
+          <w:sz w:val="28"/>
+          <w:szCs w:val="28"/>
+        </w:rPr>
+        <w:t xml:space="preserve">Start at number 1 and work down.</w:t>
+      </w:r>
+    </w:p>
+    <w:p>
+      <w:pPr>
+        <w:pStyle w:val="ListParagraph"/>
+        <w:numPr>
+          <w:ilvl w:val="0"/>
+          <w:numId w:val="4"/>
+        </w:numPr>
+        <w:spacing w:after="160"/>
+      </w:pPr>
+      <w:r>
+        <w:rPr>
+          <w:sz w:val="28"/>
+          <w:szCs w:val="28"/>
+        </w:rPr>
+        <w:t xml:space="preserve">Tap a building to open it.</w:t>
+      </w:r>
+    </w:p>
+    <w:p>
+      <w:pPr>
+        <w:spacing w:before="120"/>
+        <w:jc w:val="center"/>
+      </w:pPr>
+      <w:r>
+        <w:drawing>
+          <wp:inline distT="0" distB="0" distL="0" distR="0">
+            <wp:extent cx="2428875" cy="5257800"/>
+            <wp:effectExtent t="0" r="0" b="0" l="0"/>
+            <wp:docPr id="1" name="" descr="" title=""/>
+            <wp:cNvGraphicFramePr>
+              <a:graphicFrameLocks xmlns:a="http://schemas.openxmlformats.org/drawingml/2006/main" noChangeAspect="1"/>
+            </wp:cNvGraphicFramePr>
+            <a:graphic xmlns:a="http://schemas.openxmlformats.org/drawingml/2006/main">
+              <a:graphicData uri="http://schemas.openxmlformats.org/drawingml/2006/picture">
+                <pic:pic xmlns:pic="http://schemas.openxmlformats.org/drawingml/2006/picture">
+                  <pic:nvPicPr>
+                    <pic:cNvPr id="0" name="" descr=""/>
+                    <pic:cNvPicPr>
+                      <a:picLocks noChangeAspect="1" noChangeArrowheads="1"/>
+                    </pic:cNvPicPr>
+                  </pic:nvPicPr>
+                  <pic:blipFill>
+                    <a:blip r:embed="rId10" cstate="none"/>
+                    <a:srcRect/>
+                    <a:stretch>
+                      <a:fillRect/>
+                    </a:stretch>
+                  </pic:blipFill>
+                  <pic:spPr bwMode="auto">
+                    <a:xfrm>
+                      <a:off x="0" y="0"/>
+                      <a:ext cx="2428875" cy="5257800"/>
+                    </a:xfrm>
+                    <a:prstGeom prst="rect">
+                      <a:avLst/>
+                    </a:prstGeom>
+                  </pic:spPr>
+                </pic:pic>
+              </a:graphicData>
+            </a:graphic>
+          </wp:inline>
+        </w:drawing>
+      </w:r>
+    </w:p>
+    <w:p>
+      <w:pPr>
+        <w:spacing w:after="200" w:before="60"/>
+        <w:jc w:val="center"/>
+      </w:pPr>
+      <w:r>
+        <w:rPr>
+          <w:color w:val="5C6470"/>
+          <w:sz w:val="18"/>
+          <w:szCs w:val="18"/>
+        </w:rPr>
+        <w:t xml:space="preserve">Today’s list.</w:t>
+      </w:r>
+    </w:p>
+    <w:p>
+      <w:pPr>
+        <w:spacing w:after="160" w:before="160"/>
+      </w:pPr>
+      <w:r>
+        <w:rPr>
+          <w:color w:val="5C6470"/>
+        </w:rPr>
+        <w:t xml:space="preserve">Check means a quick tidy and re-stock. Full Clean means the whole clean. A green Done means someone has already finished that building. The arrows at the top show another day, and every other building is under Other buildings at the bottom.</w:t>
+      </w:r>
+    </w:p>
+    <w:p>
+      <w:r>
+        <w:br w:type="page"/>
+      </w:r>
+    </w:p>
+    <w:p>
+      <w:pPr>
+        <w:pStyle w:val="Heading1"/>
+      </w:pPr>
+      <w:r>
+        <w:t xml:space="preserve">When you finish a building</w:t>
+      </w:r>
+    </w:p>
+    <w:p>
+      <w:pPr>
+        <w:pStyle w:val="ListParagraph"/>
+        <w:numPr>
+          <w:ilvl w:val="0"/>
+          <w:numId w:val="5"/>
+        </w:numPr>
+        <w:spacing w:after="160"/>
+      </w:pPr>
+      <w:r>
+        <w:rPr>
+          <w:sz w:val="28"/>
+          <w:szCs w:val="28"/>
+        </w:rPr>
+        <w:t xml:space="preserve">Tap the blue button.</w:t>
+      </w:r>
+    </w:p>
+    <w:p>
+      <w:pPr>
+        <w:pStyle w:val="ListParagraph"/>
+        <w:numPr>
+          <w:ilvl w:val="0"/>
+          <w:numId w:val="5"/>
+        </w:numPr>
+        <w:spacing w:after="160"/>
+      </w:pPr>
+      <w:r>
+        <w:rPr>
+          <w:sz w:val="28"/>
+          <w:szCs w:val="28"/>
+        </w:rPr>
+        <w:t xml:space="preserve">Tap Yes, all done.</w:t>
+      </w:r>
+    </w:p>
+    <w:p>
+      <w:pPr>
+        <w:pStyle w:val="ListParagraph"/>
+        <w:numPr>
+          <w:ilvl w:val="0"/>
+          <w:numId w:val="5"/>
+        </w:numPr>
+        <w:spacing w:after="160"/>
+      </w:pPr>
+      <w:r>
+        <w:rPr>
+          <w:sz w:val="28"/>
+          <w:szCs w:val="28"/>
+        </w:rPr>
+        <w:t xml:space="preserve">That is it. The office can see it is finished.</w:t>
+      </w:r>
+    </w:p>
+    <w:tbl>
+      <w:tblPr>
+        <w:tblW w:type="dxa" w:w="8780"/>
+        <w:tblBorders>
+          <w:top w:val="none" w:color="FFFFFF" w:sz="0"/>
+          <w:left w:val="none" w:color="FFFFFF" w:sz="0"/>
+          <w:bottom w:val="none" w:color="FFFFFF" w:sz="0"/>
+          <w:right w:val="none" w:color="FFFFFF" w:sz="0"/>
+          <w:insideH w:val="none" w:color="FFFFFF" w:sz="0"/>
+          <w:insideV w:val="none" w:color="FFFFFF" w:sz="0"/>
+        </w:tblBorders>
+      </w:tblPr>
+      <w:tblGrid>
+        <w:gridCol w:w="4390"/>
+        <w:gridCol w:w="4390"/>
+      </w:tblGrid>
+      <w:tr>
+        <w:tc>
+          <w:tcPr>
+            <w:tcW w:type="dxa" w:w="4390"/>
+            <w:tcMar>
+              <w:top w:type="dxa" w:w="80"/>
+              <w:left w:type="dxa" w:w="80"/>
+              <w:bottom w:type="dxa" w:w="80"/>
+              <w:right w:type="dxa" w:w="80"/>
+            </w:tcMar>
+          </w:tcPr>
+          <w:p>
+            <w:pPr>
+              <w:jc w:val="center"/>
+            </w:pPr>
+            <w:r>
+              <w:drawing>
+                <wp:inline distT="0" distB="0" distL="0" distR="0">
+                  <wp:extent cx="1905000" cy="4124325"/>
+                  <wp:effectExtent t="0" r="0" b="0" l="0"/>
+                  <wp:docPr id="1" name="" descr="" title=""/>
+                  <wp:cNvGraphicFramePr>
+                    <a:graphicFrameLocks xmlns:a="http://schemas.openxmlformats.org/drawingml/2006/main" noChangeAspect="1"/>
+                  </wp:cNvGraphicFramePr>
+                  <a:graphic xmlns:a="http://schemas.openxmlformats.org/drawingml/2006/main">
+                    <a:graphicData uri="http://schemas.openxmlformats.org/drawingml/2006/picture">
+                      <pic:pic xmlns:pic="http://schemas.openxmlformats.org/drawingml/2006/picture">
+                        <pic:nvPicPr>
+                          <pic:cNvPr id="0" name="" descr=""/>
+                          <pic:cNvPicPr>
+                            <a:picLocks noChangeAspect="1" noChangeArrowheads="1"/>
+                          </pic:cNvPicPr>
+                        </pic:nvPicPr>
+                        <pic:blipFill>
+                          <a:blip r:embed="rId11" cstate="none"/>
                           <a:srcRect/>
                           <a:stretch>
                             <a:fillRect/>
@@ -582,7 +816,7 @@
                           </pic:cNvPicPr>
                         </pic:nvPicPr>
                         <pic:blipFill>
-                          <a:blip r:embed="rId11" cstate="none"/>
+                          <a:blip r:embed="rId12" cstate="none"/>
                           <a:srcRect/>
                           <a:stretch>
                             <a:fillRect/>
@@ -650,7 +884,7 @@
         <w:pStyle w:val="ListParagraph"/>
         <w:numPr>
           <w:ilvl w:val="0"/>
-          <w:numId w:val="5"/>
+          <w:numId w:val="6"/>
         </w:numPr>
         <w:spacing w:after="160"/>
       </w:pPr>
@@ -667,7 +901,7 @@
         <w:pStyle w:val="ListParagraph"/>
         <w:numPr>
           <w:ilvl w:val="0"/>
-          <w:numId w:val="5"/>
+          <w:numId w:val="6"/>
         </w:numPr>
         <w:spacing w:after="160"/>
       </w:pPr>
@@ -684,7 +918,7 @@
         <w:pStyle w:val="ListParagraph"/>
         <w:numPr>
           <w:ilvl w:val="0"/>
-          <w:numId w:val="5"/>
+          <w:numId w:val="6"/>
         </w:numPr>
         <w:spacing w:after="160"/>
       </w:pPr>
@@ -720,7 +954,7 @@
                     </pic:cNvPicPr>
                   </pic:nvPicPr>
                   <pic:blipFill>
-                    <a:blip r:embed="rId12" cstate="none"/>
+                    <a:blip r:embed="rId13" cstate="none"/>
                     <a:srcRect/>
                     <a:stretch>
                       <a:fillRect/>
@@ -765,6 +999,276 @@
           <w:color w:val="5C6470"/>
         </w:rPr>
         <w:t xml:space="preserve">Use it for lost property too. The office sees it straight away. You do not have to wait for an answer.</w:t>
+      </w:r>
+    </w:p>
+    <w:p>
+      <w:r>
+        <w:br w:type="page"/>
+      </w:r>
+    </w:p>
+    <w:p>
+      <w:pPr>
+        <w:pStyle w:val="Heading1"/>
+      </w:pPr>
+      <w:r>
+        <w:t xml:space="preserve">Who is working this week</w:t>
+      </w:r>
+    </w:p>
+    <w:p>
+      <w:pPr>
+        <w:pStyle w:val="ListParagraph"/>
+        <w:numPr>
+          <w:ilvl w:val="0"/>
+          <w:numId w:val="7"/>
+        </w:numPr>
+        <w:spacing w:after="160"/>
+      </w:pPr>
+      <w:r>
+        <w:rPr>
+          <w:sz w:val="28"/>
+          <w:szCs w:val="28"/>
+        </w:rPr>
+        <w:t xml:space="preserve">Tap Roster at the bottom of the screen.</w:t>
+      </w:r>
+    </w:p>
+    <w:p>
+      <w:pPr>
+        <w:pStyle w:val="ListParagraph"/>
+        <w:numPr>
+          <w:ilvl w:val="0"/>
+          <w:numId w:val="7"/>
+        </w:numPr>
+        <w:spacing w:after="160"/>
+      </w:pPr>
+      <w:r>
+        <w:rPr>
+          <w:sz w:val="28"/>
+          <w:szCs w:val="28"/>
+        </w:rPr>
+        <w:t xml:space="preserve">Your row shows the days you are on and your hours.</w:t>
+      </w:r>
+    </w:p>
+    <w:p>
+      <w:pPr>
+        <w:pStyle w:val="ListParagraph"/>
+        <w:numPr>
+          <w:ilvl w:val="0"/>
+          <w:numId w:val="7"/>
+        </w:numPr>
+        <w:spacing w:after="160"/>
+      </w:pPr>
+      <w:r>
+        <w:rPr>
+          <w:sz w:val="28"/>
+          <w:szCs w:val="28"/>
+        </w:rPr>
+        <w:t xml:space="preserve">Tap the arrows to look at another week.</w:t>
+      </w:r>
+    </w:p>
+    <w:p>
+      <w:pPr>
+        <w:spacing w:before="120"/>
+        <w:jc w:val="center"/>
+      </w:pPr>
+      <w:r>
+        <w:drawing>
+          <wp:inline distT="0" distB="0" distL="0" distR="0">
+            <wp:extent cx="2428875" cy="5257800"/>
+            <wp:effectExtent t="0" r="0" b="0" l="0"/>
+            <wp:docPr id="1" name="" descr="" title=""/>
+            <wp:cNvGraphicFramePr>
+              <a:graphicFrameLocks xmlns:a="http://schemas.openxmlformats.org/drawingml/2006/main" noChangeAspect="1"/>
+            </wp:cNvGraphicFramePr>
+            <a:graphic xmlns:a="http://schemas.openxmlformats.org/drawingml/2006/main">
+              <a:graphicData uri="http://schemas.openxmlformats.org/drawingml/2006/picture">
+                <pic:pic xmlns:pic="http://schemas.openxmlformats.org/drawingml/2006/picture">
+                  <pic:nvPicPr>
+                    <pic:cNvPr id="0" name="" descr=""/>
+                    <pic:cNvPicPr>
+                      <a:picLocks noChangeAspect="1" noChangeArrowheads="1"/>
+                    </pic:cNvPicPr>
+                  </pic:nvPicPr>
+                  <pic:blipFill>
+                    <a:blip r:embed="rId14" cstate="none"/>
+                    <a:srcRect/>
+                    <a:stretch>
+                      <a:fillRect/>
+                    </a:stretch>
+                  </pic:blipFill>
+                  <pic:spPr bwMode="auto">
+                    <a:xfrm>
+                      <a:off x="0" y="0"/>
+                      <a:ext cx="2428875" cy="5257800"/>
+                    </a:xfrm>
+                    <a:prstGeom prst="rect">
+                      <a:avLst/>
+                    </a:prstGeom>
+                  </pic:spPr>
+                </pic:pic>
+              </a:graphicData>
+            </a:graphic>
+          </wp:inline>
+        </w:drawing>
+      </w:r>
+    </w:p>
+    <w:p>
+      <w:pPr>
+        <w:spacing w:after="200" w:before="60"/>
+        <w:jc w:val="center"/>
+      </w:pPr>
+      <w:r>
+        <w:rPr>
+          <w:color w:val="5C6470"/>
+          <w:sz w:val="18"/>
+          <w:szCs w:val="18"/>
+        </w:rPr>
+        <w:t xml:space="preserve">The week, with your hours on it.</w:t>
+      </w:r>
+    </w:p>
+    <w:p>
+      <w:pPr>
+        <w:spacing w:after="160" w:before="160"/>
+      </w:pPr>
+      <w:r>
+        <w:rPr>
+          <w:color w:val="5C6470"/>
+        </w:rPr>
+        <w:t xml:space="preserve">The office writes the roster. If a shift looks wrong, ring them. A week that is not out yet will say so instead of showing you a half-finished one.</w:t>
+      </w:r>
+    </w:p>
+    <w:p>
+      <w:r>
+        <w:br w:type="page"/>
+      </w:r>
+    </w:p>
+    <w:p>
+      <w:pPr>
+        <w:pStyle w:val="Heading1"/>
+      </w:pPr>
+      <w:r>
+        <w:t xml:space="preserve">Saying when you can work</w:t>
+      </w:r>
+    </w:p>
+    <w:p>
+      <w:pPr>
+        <w:pStyle w:val="ListParagraph"/>
+        <w:numPr>
+          <w:ilvl w:val="0"/>
+          <w:numId w:val="8"/>
+        </w:numPr>
+        <w:spacing w:after="160"/>
+      </w:pPr>
+      <w:r>
+        <w:rPr>
+          <w:sz w:val="28"/>
+          <w:szCs w:val="28"/>
+        </w:rPr>
+        <w:t xml:space="preserve">Tap Roster, then My availability at the top.</w:t>
+      </w:r>
+    </w:p>
+    <w:p>
+      <w:pPr>
+        <w:pStyle w:val="ListParagraph"/>
+        <w:numPr>
+          <w:ilvl w:val="0"/>
+          <w:numId w:val="8"/>
+        </w:numPr>
+        <w:spacing w:after="160"/>
+      </w:pPr>
+      <w:r>
+        <w:rPr>
+          <w:sz w:val="28"/>
+          <w:szCs w:val="28"/>
+        </w:rPr>
+        <w:t xml:space="preserve">Tick the days you can work. Add hours if they matter.</w:t>
+      </w:r>
+    </w:p>
+    <w:p>
+      <w:pPr>
+        <w:pStyle w:val="ListParagraph"/>
+        <w:numPr>
+          <w:ilvl w:val="0"/>
+          <w:numId w:val="8"/>
+        </w:numPr>
+        <w:spacing w:after="160"/>
+      </w:pPr>
+      <w:r>
+        <w:rPr>
+          <w:sz w:val="28"/>
+          <w:szCs w:val="28"/>
+        </w:rPr>
+        <w:t xml:space="preserve">Tap Save as my usual week.</w:t>
+      </w:r>
+    </w:p>
+    <w:p>
+      <w:pPr>
+        <w:spacing w:before="120"/>
+        <w:jc w:val="center"/>
+      </w:pPr>
+      <w:r>
+        <w:drawing>
+          <wp:inline distT="0" distB="0" distL="0" distR="0">
+            <wp:extent cx="2428875" cy="5257800"/>
+            <wp:effectExtent t="0" r="0" b="0" l="0"/>
+            <wp:docPr id="1" name="" descr="" title=""/>
+            <wp:cNvGraphicFramePr>
+              <a:graphicFrameLocks xmlns:a="http://schemas.openxmlformats.org/drawingml/2006/main" noChangeAspect="1"/>
+            </wp:cNvGraphicFramePr>
+            <a:graphic xmlns:a="http://schemas.openxmlformats.org/drawingml/2006/main">
+              <a:graphicData uri="http://schemas.openxmlformats.org/drawingml/2006/picture">
+                <pic:pic xmlns:pic="http://schemas.openxmlformats.org/drawingml/2006/picture">
+                  <pic:nvPicPr>
+                    <pic:cNvPr id="0" name="" descr=""/>
+                    <pic:cNvPicPr>
+                      <a:picLocks noChangeAspect="1" noChangeArrowheads="1"/>
+                    </pic:cNvPicPr>
+                  </pic:nvPicPr>
+                  <pic:blipFill>
+                    <a:blip r:embed="rId15" cstate="none"/>
+                    <a:srcRect/>
+                    <a:stretch>
+                      <a:fillRect/>
+                    </a:stretch>
+                  </pic:blipFill>
+                  <pic:spPr bwMode="auto">
+                    <a:xfrm>
+                      <a:off x="0" y="0"/>
+                      <a:ext cx="2428875" cy="5257800"/>
+                    </a:xfrm>
+                    <a:prstGeom prst="rect">
+                      <a:avLst/>
+                    </a:prstGeom>
+                  </pic:spPr>
+                </pic:pic>
+              </a:graphicData>
+            </a:graphic>
+          </wp:inline>
+        </w:drawing>
+      </w:r>
+    </w:p>
+    <w:p>
+      <w:pPr>
+        <w:spacing w:after="200" w:before="60"/>
+        <w:jc w:val="center"/>
+      </w:pPr>
+      <w:r>
+        <w:rPr>
+          <w:color w:val="5C6470"/>
+          <w:sz w:val="18"/>
+          <w:szCs w:val="18"/>
+        </w:rPr>
+        <w:t xml:space="preserve">Tick a day, and add hours if they matter.</w:t>
+      </w:r>
+    </w:p>
+    <w:p>
+      <w:pPr>
+        <w:spacing w:after="160" w:before="160"/>
+      </w:pPr>
+      <w:r>
+        <w:rPr>
+          <w:color w:val="5C6470"/>
+        </w:rPr>
+        <w:t xml:space="preserve">Tap the star on a day you would rather work. Use Save for this week only if it is a one-off. Saving does not move a shift you already have, so ring the office if one needs to change.</w:t>
       </w:r>
     </w:p>
     <w:tbl>
@@ -1059,6 +1563,24 @@
     </w:lvlOverride>
   </w:num>
   <w:num w:numId="5">
+    <w:abstractNumId w:val="2"/>
+    <w:lvlOverride w:ilvl="0">
+      <w:startOverride w:val="1"/>
+    </w:lvlOverride>
+  </w:num>
+  <w:num w:numId="6">
+    <w:abstractNumId w:val="2"/>
+    <w:lvlOverride w:ilvl="0">
+      <w:startOverride w:val="1"/>
+    </w:lvlOverride>
+  </w:num>
+  <w:num w:numId="7">
+    <w:abstractNumId w:val="2"/>
+    <w:lvlOverride w:ilvl="0">
+      <w:startOverride w:val="1"/>
+    </w:lvlOverride>
+  </w:num>
+  <w:num w:numId="8">
     <w:abstractNumId w:val="2"/>
     <w:lvlOverride w:ilvl="0">
       <w:startOverride w:val="1"/>

</xml_diff>

<commit_message>
Give the guide a front page
The app's own icon, the camp's name, what the app is for in one line, the
line to write the address on, and what is in the rest of the guide. The two
phone numbers sit at the foot of it, where somebody reaches for them off a
shelf.

The address line moves here from the logging-in page, so it is asked for
once and on the page somebody looks at first.

Co-Authored-By: Claude Opus 5 <noreply@anthropic.com>
Claude-Session: https://claude.ai/code/session_013Lc45xwjPXCB2Gc2UUvFTS
</commit_message>
<xml_diff>
--- a/docs/cleaner-manual.docx
+++ b/docs/cleaner-manual.docx
@@ -4,7 +4,52 @@
   <w:body>
     <w:p>
       <w:pPr>
-        <w:spacing w:after="120"/>
+        <w:spacing w:after="240"/>
+      </w:pPr>
+      <w:r>
+        <w:drawing>
+          <wp:inline distT="0" distB="0" distL="0" distR="0">
+            <wp:extent cx="647700" cy="647700"/>
+            <wp:effectExtent t="0" r="0" b="0" l="0"/>
+            <wp:docPr id="1" name="" descr="" title=""/>
+            <wp:cNvGraphicFramePr>
+              <a:graphicFrameLocks xmlns:a="http://schemas.openxmlformats.org/drawingml/2006/main" noChangeAspect="1"/>
+            </wp:cNvGraphicFramePr>
+            <a:graphic xmlns:a="http://schemas.openxmlformats.org/drawingml/2006/main">
+              <a:graphicData uri="http://schemas.openxmlformats.org/drawingml/2006/picture">
+                <pic:pic xmlns:pic="http://schemas.openxmlformats.org/drawingml/2006/picture">
+                  <pic:nvPicPr>
+                    <pic:cNvPr id="0" name="" descr=""/>
+                    <pic:cNvPicPr>
+                      <a:picLocks noChangeAspect="1" noChangeArrowheads="1"/>
+                    </pic:cNvPicPr>
+                  </pic:nvPicPr>
+                  <pic:blipFill>
+                    <a:blip r:embed="rId7" cstate="none"/>
+                    <a:srcRect/>
+                    <a:stretch>
+                      <a:fillRect/>
+                    </a:stretch>
+                  </pic:blipFill>
+                  <pic:spPr bwMode="auto">
+                    <a:xfrm>
+                      <a:off x="0" y="0"/>
+                      <a:ext cx="647700" cy="647700"/>
+                    </a:xfrm>
+                    <a:prstGeom prst="rect">
+                      <a:avLst/>
+                    </a:prstGeom>
+                  </pic:spPr>
+                </pic:pic>
+              </a:graphicData>
+            </a:graphic>
+          </wp:inline>
+        </w:drawing>
+      </w:r>
+    </w:p>
+    <w:p>
+      <w:pPr>
+        <w:spacing w:after="60"/>
       </w:pPr>
       <w:r>
         <w:rPr>
@@ -12,15 +57,46 @@
           <w:sz w:val="24"/>
           <w:szCs w:val="24"/>
         </w:rPr>
+        <w:t xml:space="preserve">Woodhouse Basecamp</w:t>
+      </w:r>
+    </w:p>
+    <w:p>
+      <w:pPr>
+        <w:spacing w:after="80"/>
+      </w:pPr>
+      <w:r>
+        <w:rPr>
+          <w:b/>
+          <w:bCs/>
+          <w:sz w:val="72"/>
+          <w:szCs w:val="72"/>
+        </w:rPr>
         <w:t xml:space="preserve">The cleaning app</w:t>
       </w:r>
     </w:p>
     <w:p>
       <w:pPr>
-        <w:pStyle w:val="Heading1"/>
-      </w:pPr>
-      <w:r>
-        <w:t xml:space="preserve">Logging in</w:t>
+        <w:spacing w:after="240"/>
+      </w:pPr>
+      <w:r>
+        <w:rPr>
+          <w:color w:val="5C6470"/>
+          <w:sz w:val="34"/>
+          <w:szCs w:val="34"/>
+        </w:rPr>
+        <w:t xml:space="preserve">How to use it</w:t>
+      </w:r>
+    </w:p>
+    <w:p>
+      <w:pPr>
+        <w:spacing w:after="360"/>
+      </w:pPr>
+      <w:r>
+        <w:rPr>
+          <w:sz w:val="28"/>
+          <w:szCs w:val="28"/>
+        </w:rPr>
+        <w:t xml:space="preserve">It tells you what to clean today, and it tells the office when you have finished.</w:t>
       </w:r>
     </w:p>
     <w:p>
@@ -36,7 +112,7 @@
         <w:pBdr>
           <w:bottom w:val="single" w:color="9AA3B0" w:sz="6"/>
         </w:pBdr>
-        <w:spacing w:after="280"/>
+        <w:spacing w:after="400"/>
       </w:pPr>
       <w:r>
         <w:t xml:space="preserve"> </w:t>
@@ -44,6 +120,19 @@
     </w:p>
     <w:p>
       <w:pPr>
+        <w:spacing w:after="120"/>
+      </w:pPr>
+      <w:r>
+        <w:rPr>
+          <w:color w:val="5C6470"/>
+          <w:sz w:val="22"/>
+          <w:szCs w:val="22"/>
+        </w:rPr>
+        <w:t xml:space="preserve">What is in here</w:t>
+      </w:r>
+    </w:p>
+    <w:p>
+      <w:pPr>
         <w:pStyle w:val="ListParagraph"/>
         <w:numPr>
           <w:ilvl w:val="0"/>
@@ -56,6 +145,213 @@
           <w:sz w:val="28"/>
           <w:szCs w:val="28"/>
         </w:rPr>
+        <w:t xml:space="preserve">Logging in</w:t>
+      </w:r>
+    </w:p>
+    <w:p>
+      <w:pPr>
+        <w:pStyle w:val="ListParagraph"/>
+        <w:numPr>
+          <w:ilvl w:val="0"/>
+          <w:numId w:val="2"/>
+        </w:numPr>
+        <w:spacing w:after="160"/>
+      </w:pPr>
+      <w:r>
+        <w:rPr>
+          <w:sz w:val="28"/>
+          <w:szCs w:val="28"/>
+        </w:rPr>
+        <w:t xml:space="preserve">Putting it on your phone</w:t>
+      </w:r>
+    </w:p>
+    <w:p>
+      <w:pPr>
+        <w:pStyle w:val="ListParagraph"/>
+        <w:numPr>
+          <w:ilvl w:val="0"/>
+          <w:numId w:val="2"/>
+        </w:numPr>
+        <w:spacing w:after="160"/>
+      </w:pPr>
+      <w:r>
+        <w:rPr>
+          <w:sz w:val="28"/>
+          <w:szCs w:val="28"/>
+        </w:rPr>
+        <w:t xml:space="preserve">What to clean today</w:t>
+      </w:r>
+    </w:p>
+    <w:p>
+      <w:pPr>
+        <w:pStyle w:val="ListParagraph"/>
+        <w:numPr>
+          <w:ilvl w:val="0"/>
+          <w:numId w:val="2"/>
+        </w:numPr>
+        <w:spacing w:after="160"/>
+      </w:pPr>
+      <w:r>
+        <w:rPr>
+          <w:sz w:val="28"/>
+          <w:szCs w:val="28"/>
+        </w:rPr>
+        <w:t xml:space="preserve">When you finish a building</w:t>
+      </w:r>
+    </w:p>
+    <w:p>
+      <w:pPr>
+        <w:pStyle w:val="ListParagraph"/>
+        <w:numPr>
+          <w:ilvl w:val="0"/>
+          <w:numId w:val="2"/>
+        </w:numPr>
+        <w:spacing w:after="160"/>
+      </w:pPr>
+      <w:r>
+        <w:rPr>
+          <w:sz w:val="28"/>
+          <w:szCs w:val="28"/>
+        </w:rPr>
+        <w:t xml:space="preserve">If something is broken</w:t>
+      </w:r>
+    </w:p>
+    <w:p>
+      <w:pPr>
+        <w:pStyle w:val="ListParagraph"/>
+        <w:numPr>
+          <w:ilvl w:val="0"/>
+          <w:numId w:val="2"/>
+        </w:numPr>
+        <w:spacing w:after="160"/>
+      </w:pPr>
+      <w:r>
+        <w:rPr>
+          <w:sz w:val="28"/>
+          <w:szCs w:val="28"/>
+        </w:rPr>
+        <w:t xml:space="preserve">Who is working this week</w:t>
+      </w:r>
+    </w:p>
+    <w:p>
+      <w:pPr>
+        <w:pStyle w:val="ListParagraph"/>
+        <w:numPr>
+          <w:ilvl w:val="0"/>
+          <w:numId w:val="2"/>
+        </w:numPr>
+        <w:spacing w:after="160"/>
+      </w:pPr>
+      <w:r>
+        <w:rPr>
+          <w:sz w:val="28"/>
+          <w:szCs w:val="28"/>
+        </w:rPr>
+        <w:t xml:space="preserve">Saying when you can work</w:t>
+      </w:r>
+    </w:p>
+    <w:tbl>
+      <w:tblPr>
+        <w:tblW w:type="dxa" w:w="8780"/>
+        <w:tblBorders>
+          <w:top w:val="none" w:color="FFFFFF" w:sz="0"/>
+          <w:left w:val="none" w:color="FFFFFF" w:sz="0"/>
+          <w:bottom w:val="none" w:color="FFFFFF" w:sz="0"/>
+          <w:right w:val="none" w:color="FFFFFF" w:sz="0"/>
+          <w:insideH w:val="none" w:color="FFFFFF" w:sz="0"/>
+          <w:insideV w:val="none" w:color="FFFFFF" w:sz="0"/>
+        </w:tblBorders>
+      </w:tblPr>
+      <w:tblGrid>
+        <w:gridCol w:w="4390"/>
+        <w:gridCol w:w="4390"/>
+      </w:tblGrid>
+      <w:tr>
+        <w:tc>
+          <w:tcPr>
+            <w:tcW w:type="dxa" w:w="4390"/>
+            <w:tcMar>
+              <w:top w:type="dxa" w:w="120"/>
+              <w:left w:type="dxa" w:w="0"/>
+              <w:bottom w:type="dxa" w:w="120"/>
+              <w:right w:type="dxa" w:w="120"/>
+            </w:tcMar>
+          </w:tcPr>
+          <w:p>
+            <w:r>
+              <w:rPr>
+                <w:color w:val="5C6470"/>
+              </w:rPr>
+              <w:t xml:space="preserve">Office  </w:t>
+            </w:r>
+            <w:r>
+              <w:rPr>
+                <w:b/>
+                <w:bCs/>
+                <w:sz w:val="30"/>
+                <w:szCs w:val="30"/>
+              </w:rPr>
+              <w:t xml:space="preserve">0402 930 714</w:t>
+            </w:r>
+          </w:p>
+        </w:tc>
+        <w:tc>
+          <w:tcPr>
+            <w:tcW w:type="dxa" w:w="4390"/>
+            <w:tcMar>
+              <w:top w:type="dxa" w:w="120"/>
+              <w:left w:type="dxa" w:w="0"/>
+              <w:bottom w:type="dxa" w:w="120"/>
+              <w:right w:type="dxa" w:w="120"/>
+            </w:tcMar>
+          </w:tcPr>
+          <w:p>
+            <w:r>
+              <w:rPr>
+                <w:color w:val="5C6470"/>
+              </w:rPr>
+              <w:t xml:space="preserve">Maintenance  </w:t>
+            </w:r>
+            <w:r>
+              <w:rPr>
+                <w:b/>
+                <w:bCs/>
+                <w:sz w:val="30"/>
+                <w:szCs w:val="30"/>
+              </w:rPr>
+              <w:t xml:space="preserve">0437 316 386</w:t>
+            </w:r>
+          </w:p>
+        </w:tc>
+      </w:tr>
+    </w:tbl>
+    <w:p>
+      <w:r>
+        <w:br w:type="page"/>
+      </w:r>
+    </w:p>
+    <w:p>
+      <w:pPr>
+        <w:pStyle w:val="Heading1"/>
+      </w:pPr>
+      <w:r>
+        <w:t xml:space="preserve">Logging in</w:t>
+      </w:r>
+    </w:p>
+    <w:p>
+      <w:pPr>
+        <w:pStyle w:val="ListParagraph"/>
+        <w:numPr>
+          <w:ilvl w:val="0"/>
+          <w:numId w:val="3"/>
+        </w:numPr>
+        <w:spacing w:after="160"/>
+      </w:pPr>
+      <w:r>
+        <w:rPr>
+          <w:sz w:val="28"/>
+          <w:szCs w:val="28"/>
+        </w:rPr>
         <w:t xml:space="preserve">Open the app on your phone.</w:t>
       </w:r>
     </w:p>
@@ -64,7 +360,7 @@
         <w:pStyle w:val="ListParagraph"/>
         <w:numPr>
           <w:ilvl w:val="0"/>
-          <w:numId w:val="2"/>
+          <w:numId w:val="3"/>
         </w:numPr>
         <w:spacing w:after="160"/>
       </w:pPr>
@@ -81,7 +377,7 @@
         <w:pStyle w:val="ListParagraph"/>
         <w:numPr>
           <w:ilvl w:val="0"/>
-          <w:numId w:val="2"/>
+          <w:numId w:val="3"/>
         </w:numPr>
         <w:spacing w:after="160"/>
       </w:pPr>
@@ -143,7 +439,7 @@
                           </pic:cNvPicPr>
                         </pic:nvPicPr>
                         <pic:blipFill>
-                          <a:blip r:embed="rId7" cstate="none"/>
+                          <a:blip r:embed="rId8" cstate="none"/>
                           <a:srcRect/>
                           <a:stretch>
                             <a:fillRect/>
@@ -213,7 +509,7 @@
                           </pic:cNvPicPr>
                         </pic:nvPicPr>
                         <pic:blipFill>
-                          <a:blip r:embed="rId8" cstate="none"/>
+                          <a:blip r:embed="rId9" cstate="none"/>
                           <a:srcRect/>
                           <a:stretch>
                             <a:fillRect/>
@@ -281,7 +577,7 @@
         <w:pStyle w:val="ListParagraph"/>
         <w:numPr>
           <w:ilvl w:val="0"/>
-          <w:numId w:val="3"/>
+          <w:numId w:val="4"/>
         </w:numPr>
         <w:spacing w:after="160"/>
       </w:pPr>
@@ -298,7 +594,7 @@
         <w:pStyle w:val="ListParagraph"/>
         <w:numPr>
           <w:ilvl w:val="0"/>
-          <w:numId w:val="3"/>
+          <w:numId w:val="4"/>
         </w:numPr>
         <w:spacing w:after="160"/>
       </w:pPr>
@@ -315,7 +611,7 @@
         <w:pStyle w:val="ListParagraph"/>
         <w:numPr>
           <w:ilvl w:val="0"/>
-          <w:numId w:val="3"/>
+          <w:numId w:val="4"/>
         </w:numPr>
         <w:spacing w:after="160"/>
       </w:pPr>
@@ -377,7 +673,7 @@
                           </pic:cNvPicPr>
                         </pic:nvPicPr>
                         <pic:blipFill>
-                          <a:blip r:embed="rId9" cstate="none"/>
+                          <a:blip r:embed="rId10" cstate="none"/>
                           <a:srcRect/>
                           <a:stretch>
                             <a:fillRect/>
@@ -447,7 +743,7 @@
                           </pic:cNvPicPr>
                         </pic:nvPicPr>
                         <pic:blipFill>
-                          <a:blip r:embed="rId7" cstate="none"/>
+                          <a:blip r:embed="rId8" cstate="none"/>
                           <a:srcRect/>
                           <a:stretch>
                             <a:fillRect/>
@@ -515,7 +811,7 @@
         <w:pStyle w:val="ListParagraph"/>
         <w:numPr>
           <w:ilvl w:val="0"/>
-          <w:numId w:val="4"/>
+          <w:numId w:val="5"/>
         </w:numPr>
         <w:spacing w:after="160"/>
       </w:pPr>
@@ -532,7 +828,7 @@
         <w:pStyle w:val="ListParagraph"/>
         <w:numPr>
           <w:ilvl w:val="0"/>
-          <w:numId w:val="4"/>
+          <w:numId w:val="5"/>
         </w:numPr>
         <w:spacing w:after="160"/>
       </w:pPr>
@@ -549,7 +845,7 @@
         <w:pStyle w:val="ListParagraph"/>
         <w:numPr>
           <w:ilvl w:val="0"/>
-          <w:numId w:val="4"/>
+          <w:numId w:val="5"/>
         </w:numPr>
         <w:spacing w:after="160"/>
       </w:pPr>
@@ -585,7 +881,7 @@
                     </pic:cNvPicPr>
                   </pic:nvPicPr>
                   <pic:blipFill>
-                    <a:blip r:embed="rId10" cstate="none"/>
+                    <a:blip r:embed="rId11" cstate="none"/>
                     <a:srcRect/>
                     <a:stretch>
                       <a:fillRect/>
@@ -650,7 +946,7 @@
         <w:pStyle w:val="ListParagraph"/>
         <w:numPr>
           <w:ilvl w:val="0"/>
-          <w:numId w:val="5"/>
+          <w:numId w:val="6"/>
         </w:numPr>
         <w:spacing w:after="160"/>
       </w:pPr>
@@ -667,7 +963,7 @@
         <w:pStyle w:val="ListParagraph"/>
         <w:numPr>
           <w:ilvl w:val="0"/>
-          <w:numId w:val="5"/>
+          <w:numId w:val="6"/>
         </w:numPr>
         <w:spacing w:after="160"/>
       </w:pPr>
@@ -684,7 +980,7 @@
         <w:pStyle w:val="ListParagraph"/>
         <w:numPr>
           <w:ilvl w:val="0"/>
-          <w:numId w:val="5"/>
+          <w:numId w:val="6"/>
         </w:numPr>
         <w:spacing w:after="160"/>
       </w:pPr>
@@ -746,7 +1042,7 @@
                           </pic:cNvPicPr>
                         </pic:nvPicPr>
                         <pic:blipFill>
-                          <a:blip r:embed="rId11" cstate="none"/>
+                          <a:blip r:embed="rId12" cstate="none"/>
                           <a:srcRect/>
                           <a:stretch>
                             <a:fillRect/>
@@ -816,7 +1112,7 @@
                           </pic:cNvPicPr>
                         </pic:nvPicPr>
                         <pic:blipFill>
-                          <a:blip r:embed="rId12" cstate="none"/>
+                          <a:blip r:embed="rId13" cstate="none"/>
                           <a:srcRect/>
                           <a:stretch>
                             <a:fillRect/>
@@ -884,7 +1180,7 @@
         <w:pStyle w:val="ListParagraph"/>
         <w:numPr>
           <w:ilvl w:val="0"/>
-          <w:numId w:val="6"/>
+          <w:numId w:val="7"/>
         </w:numPr>
         <w:spacing w:after="160"/>
       </w:pPr>
@@ -901,7 +1197,7 @@
         <w:pStyle w:val="ListParagraph"/>
         <w:numPr>
           <w:ilvl w:val="0"/>
-          <w:numId w:val="6"/>
+          <w:numId w:val="7"/>
         </w:numPr>
         <w:spacing w:after="160"/>
       </w:pPr>
@@ -918,7 +1214,7 @@
         <w:pStyle w:val="ListParagraph"/>
         <w:numPr>
           <w:ilvl w:val="0"/>
-          <w:numId w:val="6"/>
+          <w:numId w:val="7"/>
         </w:numPr>
         <w:spacing w:after="160"/>
       </w:pPr>
@@ -928,141 +1224,6 @@
           <w:szCs w:val="28"/>
         </w:rPr>
         <w:t xml:space="preserve">Tap Send.</w:t>
-      </w:r>
-    </w:p>
-    <w:p>
-      <w:pPr>
-        <w:spacing w:before="120"/>
-        <w:jc w:val="center"/>
-      </w:pPr>
-      <w:r>
-        <w:drawing>
-          <wp:inline distT="0" distB="0" distL="0" distR="0">
-            <wp:extent cx="2428875" cy="5257800"/>
-            <wp:effectExtent t="0" r="0" b="0" l="0"/>
-            <wp:docPr id="1" name="" descr="" title=""/>
-            <wp:cNvGraphicFramePr>
-              <a:graphicFrameLocks xmlns:a="http://schemas.openxmlformats.org/drawingml/2006/main" noChangeAspect="1"/>
-            </wp:cNvGraphicFramePr>
-            <a:graphic xmlns:a="http://schemas.openxmlformats.org/drawingml/2006/main">
-              <a:graphicData uri="http://schemas.openxmlformats.org/drawingml/2006/picture">
-                <pic:pic xmlns:pic="http://schemas.openxmlformats.org/drawingml/2006/picture">
-                  <pic:nvPicPr>
-                    <pic:cNvPr id="0" name="" descr=""/>
-                    <pic:cNvPicPr>
-                      <a:picLocks noChangeAspect="1" noChangeArrowheads="1"/>
-                    </pic:cNvPicPr>
-                  </pic:nvPicPr>
-                  <pic:blipFill>
-                    <a:blip r:embed="rId13" cstate="none"/>
-                    <a:srcRect/>
-                    <a:stretch>
-                      <a:fillRect/>
-                    </a:stretch>
-                  </pic:blipFill>
-                  <pic:spPr bwMode="auto">
-                    <a:xfrm>
-                      <a:off x="0" y="0"/>
-                      <a:ext cx="2428875" cy="5257800"/>
-                    </a:xfrm>
-                    <a:prstGeom prst="rect">
-                      <a:avLst/>
-                    </a:prstGeom>
-                  </pic:spPr>
-                </pic:pic>
-              </a:graphicData>
-            </a:graphic>
-          </wp:inline>
-        </w:drawing>
-      </w:r>
-    </w:p>
-    <w:p>
-      <w:pPr>
-        <w:spacing w:after="200" w:before="60"/>
-        <w:jc w:val="center"/>
-      </w:pPr>
-      <w:r>
-        <w:rPr>
-          <w:color w:val="5C6470"/>
-          <w:sz w:val="18"/>
-          <w:szCs w:val="18"/>
-        </w:rPr>
-        <w:t xml:space="preserve">The report form.</w:t>
-      </w:r>
-    </w:p>
-    <w:p>
-      <w:pPr>
-        <w:spacing w:after="160" w:before="160"/>
-      </w:pPr>
-      <w:r>
-        <w:rPr>
-          <w:color w:val="5C6470"/>
-        </w:rPr>
-        <w:t xml:space="preserve">Use it for lost property too. The office sees it straight away. You do not have to wait for an answer.</w:t>
-      </w:r>
-    </w:p>
-    <w:p>
-      <w:r>
-        <w:br w:type="page"/>
-      </w:r>
-    </w:p>
-    <w:p>
-      <w:pPr>
-        <w:pStyle w:val="Heading1"/>
-      </w:pPr>
-      <w:r>
-        <w:t xml:space="preserve">Who is working this week</w:t>
-      </w:r>
-    </w:p>
-    <w:p>
-      <w:pPr>
-        <w:pStyle w:val="ListParagraph"/>
-        <w:numPr>
-          <w:ilvl w:val="0"/>
-          <w:numId w:val="7"/>
-        </w:numPr>
-        <w:spacing w:after="160"/>
-      </w:pPr>
-      <w:r>
-        <w:rPr>
-          <w:sz w:val="28"/>
-          <w:szCs w:val="28"/>
-        </w:rPr>
-        <w:t xml:space="preserve">Tap Roster at the bottom of the screen.</w:t>
-      </w:r>
-    </w:p>
-    <w:p>
-      <w:pPr>
-        <w:pStyle w:val="ListParagraph"/>
-        <w:numPr>
-          <w:ilvl w:val="0"/>
-          <w:numId w:val="7"/>
-        </w:numPr>
-        <w:spacing w:after="160"/>
-      </w:pPr>
-      <w:r>
-        <w:rPr>
-          <w:sz w:val="28"/>
-          <w:szCs w:val="28"/>
-        </w:rPr>
-        <w:t xml:space="preserve">Your row shows the days you are on and your hours.</w:t>
-      </w:r>
-    </w:p>
-    <w:p>
-      <w:pPr>
-        <w:pStyle w:val="ListParagraph"/>
-        <w:numPr>
-          <w:ilvl w:val="0"/>
-          <w:numId w:val="7"/>
-        </w:numPr>
-        <w:spacing w:after="160"/>
-      </w:pPr>
-      <w:r>
-        <w:rPr>
-          <w:sz w:val="28"/>
-          <w:szCs w:val="28"/>
-        </w:rPr>
-        <w:t xml:space="preserve">Tap the arrows to look at another week.</w:t>
       </w:r>
     </w:p>
     <w:p>
@@ -1122,7 +1283,7 @@
           <w:sz w:val="18"/>
           <w:szCs w:val="18"/>
         </w:rPr>
-        <w:t xml:space="preserve">The week, with your hours on it.</w:t>
+        <w:t xml:space="preserve">The report form.</w:t>
       </w:r>
     </w:p>
     <w:p>
@@ -1133,7 +1294,7 @@
         <w:rPr>
           <w:color w:val="5C6470"/>
         </w:rPr>
-        <w:t xml:space="preserve">The office writes the roster. If a shift looks wrong, ring them. A week that is not out yet will say so instead of showing you a half-finished one.</w:t>
+        <w:t xml:space="preserve">Use it for lost property too. The office sees it straight away. You do not have to wait for an answer.</w:t>
       </w:r>
     </w:p>
     <w:p>
@@ -1146,7 +1307,7 @@
         <w:pStyle w:val="Heading1"/>
       </w:pPr>
       <w:r>
-        <w:t xml:space="preserve">Saying when you can work</w:t>
+        <w:t xml:space="preserve">Who is working this week</w:t>
       </w:r>
     </w:p>
     <w:p>
@@ -1163,7 +1324,7 @@
           <w:sz w:val="28"/>
           <w:szCs w:val="28"/>
         </w:rPr>
-        <w:t xml:space="preserve">Tap Roster, then My availability at the top.</w:t>
+        <w:t xml:space="preserve">Tap Roster at the bottom of the screen.</w:t>
       </w:r>
     </w:p>
     <w:p>
@@ -1180,7 +1341,7 @@
           <w:sz w:val="28"/>
           <w:szCs w:val="28"/>
         </w:rPr>
-        <w:t xml:space="preserve">Tick the days you can work. Add hours if they matter.</w:t>
+        <w:t xml:space="preserve">Your row shows the days you are on and your hours.</w:t>
       </w:r>
     </w:p>
     <w:p>
@@ -1197,7 +1358,7 @@
           <w:sz w:val="28"/>
           <w:szCs w:val="28"/>
         </w:rPr>
-        <w:t xml:space="preserve">Tap Save as my usual week.</w:t>
+        <w:t xml:space="preserve">Tap the arrows to look at another week.</w:t>
       </w:r>
     </w:p>
     <w:p>
@@ -1225,6 +1386,141 @@
                   </pic:nvPicPr>
                   <pic:blipFill>
                     <a:blip r:embed="rId15" cstate="none"/>
+                    <a:srcRect/>
+                    <a:stretch>
+                      <a:fillRect/>
+                    </a:stretch>
+                  </pic:blipFill>
+                  <pic:spPr bwMode="auto">
+                    <a:xfrm>
+                      <a:off x="0" y="0"/>
+                      <a:ext cx="2428875" cy="5257800"/>
+                    </a:xfrm>
+                    <a:prstGeom prst="rect">
+                      <a:avLst/>
+                    </a:prstGeom>
+                  </pic:spPr>
+                </pic:pic>
+              </a:graphicData>
+            </a:graphic>
+          </wp:inline>
+        </w:drawing>
+      </w:r>
+    </w:p>
+    <w:p>
+      <w:pPr>
+        <w:spacing w:after="200" w:before="60"/>
+        <w:jc w:val="center"/>
+      </w:pPr>
+      <w:r>
+        <w:rPr>
+          <w:color w:val="5C6470"/>
+          <w:sz w:val="18"/>
+          <w:szCs w:val="18"/>
+        </w:rPr>
+        <w:t xml:space="preserve">The week, with your hours on it.</w:t>
+      </w:r>
+    </w:p>
+    <w:p>
+      <w:pPr>
+        <w:spacing w:after="160" w:before="160"/>
+      </w:pPr>
+      <w:r>
+        <w:rPr>
+          <w:color w:val="5C6470"/>
+        </w:rPr>
+        <w:t xml:space="preserve">The office writes the roster. If a shift looks wrong, ring them. A week that is not out yet will say so instead of showing you a half-finished one.</w:t>
+      </w:r>
+    </w:p>
+    <w:p>
+      <w:r>
+        <w:br w:type="page"/>
+      </w:r>
+    </w:p>
+    <w:p>
+      <w:pPr>
+        <w:pStyle w:val="Heading1"/>
+      </w:pPr>
+      <w:r>
+        <w:t xml:space="preserve">Saying when you can work</w:t>
+      </w:r>
+    </w:p>
+    <w:p>
+      <w:pPr>
+        <w:pStyle w:val="ListParagraph"/>
+        <w:numPr>
+          <w:ilvl w:val="0"/>
+          <w:numId w:val="9"/>
+        </w:numPr>
+        <w:spacing w:after="160"/>
+      </w:pPr>
+      <w:r>
+        <w:rPr>
+          <w:sz w:val="28"/>
+          <w:szCs w:val="28"/>
+        </w:rPr>
+        <w:t xml:space="preserve">Tap Roster, then My availability at the top.</w:t>
+      </w:r>
+    </w:p>
+    <w:p>
+      <w:pPr>
+        <w:pStyle w:val="ListParagraph"/>
+        <w:numPr>
+          <w:ilvl w:val="0"/>
+          <w:numId w:val="9"/>
+        </w:numPr>
+        <w:spacing w:after="160"/>
+      </w:pPr>
+      <w:r>
+        <w:rPr>
+          <w:sz w:val="28"/>
+          <w:szCs w:val="28"/>
+        </w:rPr>
+        <w:t xml:space="preserve">Tick the days you can work. Add hours if they matter.</w:t>
+      </w:r>
+    </w:p>
+    <w:p>
+      <w:pPr>
+        <w:pStyle w:val="ListParagraph"/>
+        <w:numPr>
+          <w:ilvl w:val="0"/>
+          <w:numId w:val="9"/>
+        </w:numPr>
+        <w:spacing w:after="160"/>
+      </w:pPr>
+      <w:r>
+        <w:rPr>
+          <w:sz w:val="28"/>
+          <w:szCs w:val="28"/>
+        </w:rPr>
+        <w:t xml:space="preserve">Tap Save as my usual week.</w:t>
+      </w:r>
+    </w:p>
+    <w:p>
+      <w:pPr>
+        <w:spacing w:before="120"/>
+        <w:jc w:val="center"/>
+      </w:pPr>
+      <w:r>
+        <w:drawing>
+          <wp:inline distT="0" distB="0" distL="0" distR="0">
+            <wp:extent cx="2428875" cy="5257800"/>
+            <wp:effectExtent t="0" r="0" b="0" l="0"/>
+            <wp:docPr id="1" name="" descr="" title=""/>
+            <wp:cNvGraphicFramePr>
+              <a:graphicFrameLocks xmlns:a="http://schemas.openxmlformats.org/drawingml/2006/main" noChangeAspect="1"/>
+            </wp:cNvGraphicFramePr>
+            <a:graphic xmlns:a="http://schemas.openxmlformats.org/drawingml/2006/main">
+              <a:graphicData uri="http://schemas.openxmlformats.org/drawingml/2006/picture">
+                <pic:pic xmlns:pic="http://schemas.openxmlformats.org/drawingml/2006/picture">
+                  <pic:nvPicPr>
+                    <pic:cNvPr id="0" name="" descr=""/>
+                    <pic:cNvPicPr>
+                      <a:picLocks noChangeAspect="1" noChangeArrowheads="1"/>
+                    </pic:cNvPicPr>
+                  </pic:nvPicPr>
+                  <pic:blipFill>
+                    <a:blip r:embed="rId16" cstate="none"/>
                     <a:srcRect/>
                     <a:stretch>
                       <a:fillRect/>
@@ -1581,6 +1877,12 @@
     </w:lvlOverride>
   </w:num>
   <w:num w:numId="8">
+    <w:abstractNumId w:val="2"/>
+    <w:lvlOverride w:ilvl="0">
+      <w:startOverride w:val="1"/>
+    </w:lvlOverride>
+  </w:num>
+  <w:num w:numId="9">
     <w:abstractNumId w:val="2"/>
     <w:lvlOverride w:ilvl="0">
       <w:startOverride w:val="1"/>

</xml_diff>